<commit_message>
docs: Production Type in A1, Export from the InterSystems Explorer
The edits from the Word copy of the handout, moved into the generated
document. Part G and the call-outs stay.

Co-Authored-By: Claude Opus 5.5 (1M context) <noreply@anthropic.com>
</commit_message>
<xml_diff>
--- a/docs/Lab_Handout.docx
+++ b/docs/Lab_Handout.docx
@@ -3209,7 +3209,45 @@
           <w:sz w:val="21"/>
           <w:szCs w:val="21"/>
         </w:rPr>
-        <w:t xml:space="preserve">You make the production, the DTLs and the BPLs in the Management Portal. They are on the server. To see them in VS Code, use the InterSystems Explorer view.</w:t>
+        <w:t xml:space="preserve">You make the production, the DTLs and the BPLs in the Management Portal. They are on the server. To see them in VS Code, use the InterSystems Explorer view. To copy them into </w:t>
+      </w:r>
+      <w:r>
+        <w:rPr>
+          <w:rFonts w:ascii="Consolas" w:cs="Consolas" w:eastAsia="Consolas" w:hAnsi="Consolas"/>
+          <w:color w:val="6B2C91"/>
+          <w:sz w:val="19"/>
+          <w:szCs w:val="19"/>
+        </w:rPr>
+        <w:t xml:space="preserve">src/</w:t>
+      </w:r>
+      <w:r>
+        <w:rPr>
+          <w:rFonts w:ascii="Calibri" w:cs="Calibri" w:eastAsia="Calibri" w:hAnsi="Calibri"/>
+          <w:color w:val="333F48"/>
+          <w:sz w:val="21"/>
+          <w:szCs w:val="21"/>
+        </w:rPr>
+        <w:t xml:space="preserve">, right-click them in that view and click </w:t>
+      </w:r>
+      <w:r>
+        <w:rPr>
+          <w:rFonts w:ascii="Calibri" w:cs="Calibri" w:eastAsia="Calibri" w:hAnsi="Calibri"/>
+          <w:b/>
+          <w:bCs/>
+          <w:color w:val="333F48"/>
+          <w:sz w:val="21"/>
+          <w:szCs w:val="21"/>
+        </w:rPr>
+        <w:t xml:space="preserve">Export</w:t>
+      </w:r>
+      <w:r>
+        <w:rPr>
+          <w:rFonts w:ascii="Calibri" w:cs="Calibri" w:eastAsia="Calibri" w:hAnsi="Calibri"/>
+          <w:color w:val="333F48"/>
+          <w:sz w:val="21"/>
+          <w:szCs w:val="21"/>
+        </w:rPr>
+        <w:t xml:space="preserve">.</w:t>
       </w:r>
     </w:p>
     <w:p>
@@ -3403,16 +3441,18 @@
           <w:sz w:val="21"/>
           <w:szCs w:val="21"/>
         </w:rPr>
-        <w:t xml:space="preserve">. Description: </w:t>
-      </w:r>
-      <w:r>
-        <w:rPr>
-          <w:rFonts w:ascii="Consolas" w:cs="Consolas" w:eastAsia="Consolas" w:hAnsi="Consolas"/>
-          <w:color w:val="6B2C91"/>
-          <w:sz w:val="19"/>
-          <w:szCs w:val="19"/>
-        </w:rPr>
-        <w:t xml:space="preserve">Lab: GetPreAuthInfo_View with PAT-01 and Getinsurer</w:t>
+        <w:t xml:space="preserve">. Production Type: </w:t>
+      </w:r>
+      <w:r>
+        <w:rPr>
+          <w:rFonts w:ascii="Calibri" w:cs="Calibri" w:eastAsia="Calibri" w:hAnsi="Calibri"/>
+          <w:b/>
+          <w:bCs/>
+          <w:color w:val="333F48"/>
+          <w:sz w:val="21"/>
+          <w:szCs w:val="21"/>
+        </w:rPr>
+        <w:t xml:space="preserve">Generic</w:t>
       </w:r>
       <w:r>
         <w:rPr>

</xml_diff>